<commit_message>
Add sensitive information redaction
</commit_message>
<xml_diff>
--- a/docs/Supplier_Redaction_Pipeline_Technical_Documentation.docx
+++ b/docs/Supplier_Redaction_Pipeline_Technical_Documentation.docx
@@ -41,7 +41,7 @@
     </w:p>
     <w:p>
       <w:r>
-        <w:t>The system redacts supplier-identifying information from tender and contract documents. It supports PDF and DOCX input, produces redacted PDF or DOCX output, and records redaction metadata for operator review. The application is currently optimized for local Windows execution but is structured for future deployment by separating UI concerns from backend processing.</w:t>
+        <w:t>The system redacts supplier-identifying information and selected sensitive personal/financial information from tender and contract documents. It supports PDF and DOCX input, produces redacted PDF or DOCX output, and records redaction metadata for operator review. The application is currently optimized for local Windows execution but is structured for future deployment by separating UI concerns from backend processing.</w:t>
       </w:r>
     </w:p>
     <w:p>
@@ -65,7 +65,7 @@
         <w:pStyle w:val="ListBullet"/>
       </w:pPr>
       <w:r>
-        <w:t>The redaction engine performs document parsing, OCR coordination, supplier-name resolution, text redaction, image redaction, and output creation.</w:t>
+        <w:t>The redaction engine performs document parsing, OCR coordination, supplier-name resolution, sensitive-pattern detection, text redaction, image redaction, and output creation.</w:t>
       </w:r>
     </w:p>
     <w:p>
@@ -125,6 +125,8 @@
         <w:br/>
         <w:t xml:space="preserve">  |-- Supplier parsing/detection (app/detection.py)</w:t>
         <w:br/>
+        <w:t xml:space="preserve">  |-- Sensitive pattern detection (app/sensitive.py)</w:t>
+        <w:br/>
         <w:t xml:space="preserve">  |-- Tesseract OCR (app/ocr.py)</w:t>
         <w:br/>
         <w:t xml:space="preserve">  |-- Optional Azure OCR (app/document_intelligence.py)</w:t>
@@ -283,7 +285,7 @@
           </w:tcPr>
           <w:p>
             <w:r>
-              <w:t>Manual names, exact/native matches, OCR token matches, and explicit image options are used.</w:t>
+              <w:t>Manual names, selected sensitive-field patterns, exact/native matches, OCR token matches, and explicit image options are used.</w:t>
             </w:r>
           </w:p>
         </w:tc>
@@ -400,7 +402,7 @@
         <w:pStyle w:val="ListNumber"/>
       </w:pPr>
       <w:r>
-        <w:t>The user enters supplier names and selects discovery, image redaction, OCR, and replacement-label options.</w:t>
+        <w:t>The user enters supplier names and selects sensitive information, discovery, image redaction, OCR, and replacement-label options.</w:t>
       </w:r>
     </w:p>
     <w:p>
@@ -432,7 +434,7 @@
         <w:pStyle w:val="ListNumber"/>
       </w:pPr>
       <w:r>
-        <w:t>The pipeline extracts native text and optionally uses OCR/LLM/heuristic sources to resolve supplier names.</w:t>
+        <w:t>The pipeline extracts native text, detects selected sensitive categories, and optionally uses OCR/LLM/heuristic sources to resolve supplier names.</w:t>
       </w:r>
     </w:p>
     <w:p>
@@ -558,6 +560,38 @@
           </w:tcPr>
           <w:p>
             <w:r>
+              <w:t>Sensitive information to redact</w:t>
+            </w:r>
+          </w:p>
+        </w:tc>
+        <w:tc>
+          <w:tcPr>
+            <w:tcW w:type="dxa" w:w="3408"/>
+          </w:tcPr>
+          <w:p>
+            <w:r>
+              <w:t>sensitive_fields</w:t>
+            </w:r>
+          </w:p>
+        </w:tc>
+        <w:tc>
+          <w:tcPr>
+            <w:tcW w:type="dxa" w:w="3408"/>
+          </w:tcPr>
+          <w:p>
+            <w:r>
+              <w:t>Multiselect categories for deterministic redaction of email addresses, phone numbers, bank account details, and addresses.</w:t>
+            </w:r>
+          </w:p>
+        </w:tc>
+      </w:tr>
+      <w:tr>
+        <w:tc>
+          <w:tcPr>
+            <w:tcW w:type="dxa" w:w="3408"/>
+          </w:tcPr>
+          <w:p>
+            <w:r>
               <w:t>Manual names only</w:t>
             </w:r>
           </w:p>
@@ -877,7 +911,225 @@
         <w:pStyle w:val="Heading1"/>
       </w:pPr>
       <w:r>
-        <w:t>6. Supplier Name Handling</w:t>
+        <w:t>6. Sensitive Information Handling</w:t>
+      </w:r>
+    </w:p>
+    <w:p>
+      <w:r>
+        <w:t>Sensitive information redaction is controlled by explicit user-selected categories. The pipeline does not redact every possible number or line by default; it applies deterministic patterns only for the selected categories so operators remain in control of the redaction scope.</w:t>
+      </w:r>
+    </w:p>
+    <w:tbl>
+      <w:tblPr>
+        <w:tblStyle w:val="TableGrid"/>
+        <w:tblW w:type="auto" w:w="0"/>
+        <w:tblLook w:firstColumn="1" w:firstRow="1" w:lastColumn="0" w:lastRow="0" w:noHBand="0" w:noVBand="1" w:val="04A0"/>
+      </w:tblPr>
+      <w:tblGrid>
+        <w:gridCol w:w="3408"/>
+        <w:gridCol w:w="3408"/>
+        <w:gridCol w:w="3408"/>
+      </w:tblGrid>
+      <w:tr>
+        <w:tc>
+          <w:tcPr>
+            <w:tcW w:type="dxa" w:w="3408"/>
+          </w:tcPr>
+          <w:p>
+            <w:r>
+              <w:rPr>
+                <w:b/>
+              </w:rPr>
+              <w:t>Category</w:t>
+            </w:r>
+          </w:p>
+        </w:tc>
+        <w:tc>
+          <w:tcPr>
+            <w:tcW w:type="dxa" w:w="3408"/>
+          </w:tcPr>
+          <w:p>
+            <w:r>
+              <w:rPr>
+                <w:b/>
+              </w:rPr>
+              <w:t>Detection Approach</w:t>
+            </w:r>
+          </w:p>
+        </w:tc>
+        <w:tc>
+          <w:tcPr>
+            <w:tcW w:type="dxa" w:w="3408"/>
+          </w:tcPr>
+          <w:p>
+            <w:r>
+              <w:rPr>
+                <w:b/>
+              </w:rPr>
+              <w:t>Notes</w:t>
+            </w:r>
+          </w:p>
+        </w:tc>
+      </w:tr>
+      <w:tr>
+        <w:tc>
+          <w:tcPr>
+            <w:tcW w:type="dxa" w:w="3408"/>
+          </w:tcPr>
+          <w:p>
+            <w:r>
+              <w:t>Email addresses</w:t>
+            </w:r>
+          </w:p>
+        </w:tc>
+        <w:tc>
+          <w:tcPr>
+            <w:tcW w:type="dxa" w:w="3408"/>
+          </w:tcPr>
+          <w:p>
+            <w:r>
+              <w:t>Email regex pattern.</w:t>
+            </w:r>
+          </w:p>
+        </w:tc>
+        <w:tc>
+          <w:tcPr>
+            <w:tcW w:type="dxa" w:w="3408"/>
+          </w:tcPr>
+          <w:p>
+            <w:r>
+              <w:t>Matches standard mailbox@domain formats.</w:t>
+            </w:r>
+          </w:p>
+        </w:tc>
+      </w:tr>
+      <w:tr>
+        <w:tc>
+          <w:tcPr>
+            <w:tcW w:type="dxa" w:w="3408"/>
+          </w:tcPr>
+          <w:p>
+            <w:r>
+              <w:t>Phone numbers</w:t>
+            </w:r>
+          </w:p>
+        </w:tc>
+        <w:tc>
+          <w:tcPr>
+            <w:tcW w:type="dxa" w:w="3408"/>
+          </w:tcPr>
+          <w:p>
+            <w:r>
+              <w:t>Phone-number pattern with support for country codes, separators, and 10-digit numbers.</w:t>
+            </w:r>
+          </w:p>
+        </w:tc>
+        <w:tc>
+          <w:tcPr>
+            <w:tcW w:type="dxa" w:w="3408"/>
+          </w:tcPr>
+          <w:p>
+            <w:r>
+              <w:t>Can overlap with numeric identifiers in some documents, so it is user-selectable.</w:t>
+            </w:r>
+          </w:p>
+        </w:tc>
+      </w:tr>
+      <w:tr>
+        <w:tc>
+          <w:tcPr>
+            <w:tcW w:type="dxa" w:w="3408"/>
+          </w:tcPr>
+          <w:p>
+            <w:r>
+              <w:t>Bank account details</w:t>
+            </w:r>
+          </w:p>
+        </w:tc>
+        <w:tc>
+          <w:tcPr>
+            <w:tcW w:type="dxa" w:w="3408"/>
+          </w:tcPr>
+          <w:p>
+            <w:r>
+              <w:t>IBAN/IFSC-style patterns and account/bank/routing/swift context lines.</w:t>
+            </w:r>
+          </w:p>
+        </w:tc>
+        <w:tc>
+          <w:tcPr>
+            <w:tcW w:type="dxa" w:w="3408"/>
+          </w:tcPr>
+          <w:p>
+            <w:r>
+              <w:t>Context is required for generic long account numbers to reduce false positives.</w:t>
+            </w:r>
+          </w:p>
+        </w:tc>
+      </w:tr>
+      <w:tr>
+        <w:tc>
+          <w:tcPr>
+            <w:tcW w:type="dxa" w:w="3408"/>
+          </w:tcPr>
+          <w:p>
+            <w:r>
+              <w:t>Addresses</w:t>
+            </w:r>
+          </w:p>
+        </w:tc>
+        <w:tc>
+          <w:tcPr>
+            <w:tcW w:type="dxa" w:w="3408"/>
+          </w:tcPr>
+          <w:p>
+            <w:r>
+              <w:t>Address keyword and street/postal-code line patterns.</w:t>
+            </w:r>
+          </w:p>
+        </w:tc>
+        <w:tc>
+          <w:tcPr>
+            <w:tcW w:type="dxa" w:w="3408"/>
+          </w:tcPr>
+          <w:p>
+            <w:r>
+              <w:t>Address detection is line-based and intentionally conservative.</w:t>
+            </w:r>
+          </w:p>
+        </w:tc>
+      </w:tr>
+    </w:tbl>
+    <w:p>
+      <w:pPr>
+        <w:pStyle w:val="ListBullet"/>
+      </w:pPr>
+      <w:r>
+        <w:t>Sensitive hits are recorded by category label, not by raw sensitive value, so the result table does not re-expose the redacted information.</w:t>
+      </w:r>
+    </w:p>
+    <w:p>
+      <w:pPr>
+        <w:pStyle w:val="ListBullet"/>
+      </w:pPr>
+      <w:r>
+        <w:t>PDF native text, OCR text, and DOCX text all use the shared sensitive detection module.</w:t>
+      </w:r>
+    </w:p>
+    <w:p>
+      <w:pPr>
+        <w:pStyle w:val="ListBullet"/>
+      </w:pPr>
+      <w:r>
+        <w:t>The feature can run without supplier names; the user can redact only selected sensitive information if needed.</w:t>
+      </w:r>
+    </w:p>
+    <w:p>
+      <w:pPr>
+        <w:pStyle w:val="Heading1"/>
+      </w:pPr>
+      <w:r>
+        <w:t>7. Supplier Name Handling</w:t>
       </w:r>
     </w:p>
     <w:p>
@@ -938,7 +1190,7 @@
         <w:pStyle w:val="Heading1"/>
       </w:pPr>
       <w:r>
-        <w:t>7. PDF Redaction Path</w:t>
+        <w:t>8. PDF Redaction Path</w:t>
       </w:r>
     </w:p>
     <w:p>
@@ -1002,7 +1254,23 @@
         <w:pStyle w:val="ListNumber"/>
       </w:pPr>
       <w:r>
+        <w:t>Search native PDF text for selected sensitive-information patterns and add redaction annotations.</w:t>
+      </w:r>
+    </w:p>
+    <w:p>
+      <w:pPr>
+        <w:pStyle w:val="ListNumber"/>
+      </w:pPr>
+      <w:r>
         <w:t>Find OCR token-sequence matches and redact the corresponding OCR bounding boxes.</w:t>
+      </w:r>
+    </w:p>
+    <w:p>
+      <w:pPr>
+        <w:pStyle w:val="ListNumber"/>
+      </w:pPr>
+      <w:r>
+        <w:t>Find OCR sensitive-information matches and redact the corresponding OCR bounding boxes.</w:t>
       </w:r>
     </w:p>
     <w:p>
@@ -1026,7 +1294,7 @@
         <w:pStyle w:val="Heading1"/>
       </w:pPr>
       <w:r>
-        <w:t>8. DOCX Redaction Path</w:t>
+        <w:t>9. DOCX Redaction Path</w:t>
       </w:r>
     </w:p>
     <w:p>
@@ -1074,6 +1342,14 @@
         <w:pStyle w:val="ListNumber"/>
       </w:pPr>
       <w:r>
+        <w:t>Replace selected sensitive-information matches inside Word runs.</w:t>
+      </w:r>
+    </w:p>
+    <w:p>
+      <w:pPr>
+        <w:pStyle w:val="ListNumber"/>
+      </w:pPr>
+      <w:r>
         <w:t>Save the redacted DOCX under data/outputs.</w:t>
       </w:r>
     </w:p>
@@ -1090,7 +1366,7 @@
         <w:pStyle w:val="Heading1"/>
       </w:pPr>
       <w:r>
-        <w:t>9. Component Responsibilities</w:t>
+        <w:t>10. Component Responsibilities</w:t>
       </w:r>
     </w:p>
     <w:tbl>
@@ -1344,6 +1620,38 @@
           </w:tcPr>
           <w:p>
             <w:r>
+              <w:t>app/sensitive.py</w:t>
+            </w:r>
+          </w:p>
+        </w:tc>
+        <w:tc>
+          <w:tcPr>
+            <w:tcW w:type="dxa" w:w="3408"/>
+          </w:tcPr>
+          <w:p>
+            <w:r>
+              <w:t>Sensitive information category labels, parsing, detection patterns, and replacement helpers.</w:t>
+            </w:r>
+          </w:p>
+        </w:tc>
+        <w:tc>
+          <w:tcPr>
+            <w:tcW w:type="dxa" w:w="3408"/>
+          </w:tcPr>
+          <w:p>
+            <w:r>
+              <w:t>Keeps email, phone, bank detail, and address redaction behavior consistent across UI/API/CLI/PDF/DOCX/OCR paths.</w:t>
+            </w:r>
+          </w:p>
+        </w:tc>
+      </w:tr>
+      <w:tr>
+        <w:tc>
+          <w:tcPr>
+            <w:tcW w:type="dxa" w:w="3408"/>
+          </w:tcPr>
+          <w:p>
+            <w:r>
               <w:t>app/ocr.py</w:t>
             </w:r>
           </w:p>
@@ -1503,7 +1811,7 @@
         <w:pStyle w:val="Heading1"/>
       </w:pPr>
       <w:r>
-        <w:t>10. Dependency Rationale</w:t>
+        <w:t>11. Dependency Rationale</w:t>
       </w:r>
     </w:p>
     <w:p>
@@ -1953,7 +2261,7 @@
         <w:pStyle w:val="Heading1"/>
       </w:pPr>
       <w:r>
-        <w:t>11. Configuration Reference</w:t>
+        <w:t>12. Configuration Reference</w:t>
       </w:r>
     </w:p>
     <w:tbl>
@@ -2590,7 +2898,7 @@
         <w:pStyle w:val="Heading1"/>
       </w:pPr>
       <w:r>
-        <w:t>12. API Contract</w:t>
+        <w:t>13. API Contract</w:t>
       </w:r>
     </w:p>
     <w:p>
@@ -2870,6 +3178,38 @@
           </w:tcPr>
           <w:p>
             <w:r>
+              <w:t>sensitive_fields</w:t>
+            </w:r>
+          </w:p>
+        </w:tc>
+        <w:tc>
+          <w:tcPr>
+            <w:tcW w:type="dxa" w:w="3408"/>
+          </w:tcPr>
+          <w:p>
+            <w:r>
+              <w:t>string</w:t>
+            </w:r>
+          </w:p>
+        </w:tc>
+        <w:tc>
+          <w:tcPr>
+            <w:tcW w:type="dxa" w:w="3408"/>
+          </w:tcPr>
+          <w:p>
+            <w:r>
+              <w:t>Sensitive categories separated by commas, spaces, semicolons, or pipes. Supported values: email, phone, bank_account, address.</w:t>
+            </w:r>
+          </w:p>
+        </w:tc>
+      </w:tr>
+      <w:tr>
+        <w:tc>
+          <w:tcPr>
+            <w:tcW w:type="dxa" w:w="3408"/>
+          </w:tcPr>
+          <w:p>
+            <w:r>
               <w:t>detect_supplier_names</w:t>
             </w:r>
           </w:p>
@@ -3061,7 +3401,7 @@
         <w:pStyle w:val="Heading1"/>
       </w:pPr>
       <w:r>
-        <w:t>13. Result Metadata</w:t>
+        <w:t>14. Result Metadata</w:t>
       </w:r>
     </w:p>
     <w:tbl>
@@ -3241,6 +3581,28 @@
           </w:tcPr>
           <w:p>
             <w:r>
+              <w:t>sensitive_fields</w:t>
+            </w:r>
+          </w:p>
+        </w:tc>
+        <w:tc>
+          <w:tcPr>
+            <w:tcW w:type="dxa" w:w="5112"/>
+          </w:tcPr>
+          <w:p>
+            <w:r>
+              <w:t>Sensitive information categories selected for the request.</w:t>
+            </w:r>
+          </w:p>
+        </w:tc>
+      </w:tr>
+      <w:tr>
+        <w:tc>
+          <w:tcPr>
+            <w:tcW w:type="dxa" w:w="5112"/>
+          </w:tcPr>
+          <w:p>
+            <w:r>
               <w:t>extraction_sources</w:t>
             </w:r>
           </w:p>
@@ -3284,7 +3646,7 @@
         <w:pStyle w:val="Heading1"/>
       </w:pPr>
       <w:r>
-        <w:t>14. Runtime Data Management</w:t>
+        <w:t>15. Runtime Data Management</w:t>
       </w:r>
     </w:p>
     <w:tbl>
@@ -3537,7 +3899,7 @@
         <w:pStyle w:val="Heading1"/>
       </w:pPr>
       <w:r>
-        <w:t>15. Validation and Smoke Testing</w:t>
+        <w:t>16. Validation and Smoke Testing</w:t>
       </w:r>
     </w:p>
     <w:p>
@@ -3551,6 +3913,14 @@
       </w:pPr>
       <w:r>
         <w:t>Verifies GET /health.</w:t>
+      </w:r>
+    </w:p>
+    <w:p>
+      <w:pPr>
+        <w:pStyle w:val="ListBullet"/>
+      </w:pPr>
+      <w:r>
+        <w:t>Creates a synthetic PDF and verifies email, phone, bank account detail, and address redaction.</w:t>
       </w:r>
     </w:p>
     <w:p>
@@ -3609,7 +3979,7 @@
         <w:pStyle w:val="Heading1"/>
       </w:pPr>
       <w:r>
-        <w:t>16. Security and Compliance Considerations</w:t>
+        <w:t>17. Security and Compliance Considerations</w:t>
       </w:r>
     </w:p>
     <w:p>
@@ -3665,7 +4035,7 @@
         <w:pStyle w:val="Heading1"/>
       </w:pPr>
       <w:r>
-        <w:t>17. Known Limitations</w:t>
+        <w:t>18. Known Limitations</w:t>
       </w:r>
     </w:p>
     <w:p>
@@ -3713,6 +4083,22 @@
         <w:pStyle w:val="ListBullet"/>
       </w:pPr>
       <w:r>
+        <w:t>Sensitive information detection uses deterministic patterns and may not catch every real-world address or account format.</w:t>
+      </w:r>
+    </w:p>
+    <w:p>
+      <w:pPr>
+        <w:pStyle w:val="ListBullet"/>
+      </w:pPr>
+      <w:r>
+        <w:t>Phone and address formats vary by country; production deployments may need locale-specific pattern packs.</w:t>
+      </w:r>
+    </w:p>
+    <w:p>
+      <w:pPr>
+        <w:pStyle w:val="ListBullet"/>
+      </w:pPr>
+      <w:r>
         <w:t>Image redaction applies to embedded image objects. Normal selectable header/footer text is handled by text redaction, not image settings.</w:t>
       </w:r>
     </w:p>
@@ -3729,7 +4115,7 @@
         <w:pStyle w:val="Heading1"/>
       </w:pPr>
       <w:r>
-        <w:t>18. Production Readiness Roadmap</w:t>
+        <w:t>19. Production Readiness Roadmap</w:t>
       </w:r>
     </w:p>
     <w:tbl>
@@ -4025,7 +4411,7 @@
           </w:tcPr>
           <w:p>
             <w:r>
-              <w:t>Add unit tests for parsing, alias expansion, OCR matching, API options, and DOCX edge cases.</w:t>
+              <w:t>Add unit tests for parsing, alias expansion, sensitive patterns, OCR matching, API options, and DOCX edge cases.</w:t>
             </w:r>
           </w:p>
         </w:tc>
@@ -4046,7 +4432,7 @@
         <w:pStyle w:val="Heading1"/>
       </w:pPr>
       <w:r>
-        <w:t>19. Operating Commands</w:t>
+        <w:t>20. Operating Commands</w:t>
       </w:r>
     </w:p>
     <w:tbl>
@@ -4225,7 +4611,7 @@
         <w:pStyle w:val="Heading1"/>
       </w:pPr>
       <w:r>
-        <w:t>20. Summary</w:t>
+        <w:t>21. Summary</w:t>
       </w:r>
     </w:p>
     <w:p>

</xml_diff>